<commit_message>
feat: first-visit bilingual status pop-up + onboarding centering + manual/CSS fixes
- NEW once-only first-visit pop-up on home (src/home-status-popup.js): concise
  EN + big professional Thai "status & rationale" notice; close → browse as
  usual; never shown again (localStorage fp_home_status_seen_v1). Replaces the
  old multi-step intro tour on home so there's a single first-time experience.
- Center consent.html + my-data.html content columns (mx-auto) — were left-pinned.
- Recompile styles.css (max-w-3xl/4xl now present; fixes stale-CSS drift).
- html2fp: skip the manual's cover-stats block so it no longer flattens into a
  jumbled number/label list; rebuilt the Teacher's Manual.

Co-Authored-By: Claude Opus 4.7 (1M context) <noreply@anthropic.com>
</commit_message>
<xml_diff>
--- a/docs/teacher-manual/FUTUREPROOF-Teacher-Manual.docx
+++ b/docs/teacher-manual/FUTUREPROOF-Teacher-Manual.docx
@@ -243,156 +243,6 @@
           <w:sz w:val="25"/>
         </w:rPr>
         <w:t xml:space="preserve"> who need to audit the architecture and the pedagogical claims behind it. Every chapter is written so either audience can read it cold and answer their own first question.</w:t>
-      </w:r>
-    </w:p>
-    <w:p>
-      <w:pPr>
-        <w:spacing w:after="140" w:line="324" w:lineRule="auto"/>
-      </w:pPr>
-      <w:r>
-        <w:rPr>
-          <w:rFonts w:ascii="Avenir Next" w:hAnsi="Avenir Next" w:cs="Avenir Next"/>
-          <w:b w:val="0"/>
-          <w:i w:val="0"/>
-          <w:color w:val="000000"/>
-          <w:sz w:val="25"/>
-        </w:rPr>
-        <w:t>6</w:t>
-      </w:r>
-    </w:p>
-    <w:p>
-      <w:pPr>
-        <w:spacing w:after="140" w:line="324" w:lineRule="auto"/>
-      </w:pPr>
-      <w:r>
-        <w:rPr>
-          <w:rFonts w:ascii="Avenir Next" w:hAnsi="Avenir Next" w:cs="Avenir Next"/>
-          <w:b w:val="0"/>
-          <w:i w:val="0"/>
-          <w:color w:val="000000"/>
-          <w:sz w:val="25"/>
-        </w:rPr>
-        <w:t>SDG Missions</w:t>
-      </w:r>
-    </w:p>
-    <w:p>
-      <w:pPr>
-        <w:spacing w:after="140" w:line="324" w:lineRule="auto"/>
-      </w:pPr>
-      <w:r>
-        <w:rPr>
-          <w:rFonts w:ascii="Avenir Next" w:hAnsi="Avenir Next" w:cs="Avenir Next"/>
-          <w:b w:val="0"/>
-          <w:i w:val="0"/>
-          <w:color w:val="000000"/>
-          <w:sz w:val="25"/>
-        </w:rPr>
-        <w:t>5</w:t>
-      </w:r>
-    </w:p>
-    <w:p>
-      <w:pPr>
-        <w:spacing w:after="140" w:line="324" w:lineRule="auto"/>
-      </w:pPr>
-      <w:r>
-        <w:rPr>
-          <w:rFonts w:ascii="Avenir Next" w:hAnsi="Avenir Next" w:cs="Avenir Next"/>
-          <w:b w:val="0"/>
-          <w:i w:val="0"/>
-          <w:color w:val="000000"/>
-          <w:sz w:val="25"/>
-        </w:rPr>
-        <w:t>Stage Arc</w:t>
-      </w:r>
-    </w:p>
-    <w:p>
-      <w:pPr>
-        <w:spacing w:after="140" w:line="324" w:lineRule="auto"/>
-      </w:pPr>
-      <w:r>
-        <w:rPr>
-          <w:rFonts w:ascii="Avenir Next" w:hAnsi="Avenir Next" w:cs="Avenir Next"/>
-          <w:b w:val="0"/>
-          <w:i w:val="0"/>
-          <w:color w:val="000000"/>
-          <w:sz w:val="25"/>
-        </w:rPr>
-        <w:t>4</w:t>
-      </w:r>
-    </w:p>
-    <w:p>
-      <w:pPr>
-        <w:spacing w:after="140" w:line="324" w:lineRule="auto"/>
-      </w:pPr>
-      <w:r>
-        <w:rPr>
-          <w:rFonts w:ascii="Avenir Next" w:hAnsi="Avenir Next" w:cs="Avenir Next"/>
-          <w:b w:val="0"/>
-          <w:i w:val="0"/>
-          <w:color w:val="000000"/>
-          <w:sz w:val="25"/>
-        </w:rPr>
-        <w:t>Rubrics</w:t>
-      </w:r>
-    </w:p>
-    <w:p>
-      <w:pPr>
-        <w:spacing w:after="140" w:line="324" w:lineRule="auto"/>
-      </w:pPr>
-      <w:r>
-        <w:rPr>
-          <w:rFonts w:ascii="Avenir Next" w:hAnsi="Avenir Next" w:cs="Avenir Next"/>
-          <w:b w:val="0"/>
-          <w:i w:val="0"/>
-          <w:color w:val="000000"/>
-          <w:sz w:val="25"/>
-        </w:rPr>
-        <w:t>3</w:t>
-      </w:r>
-    </w:p>
-    <w:p>
-      <w:pPr>
-        <w:spacing w:after="140" w:line="324" w:lineRule="auto"/>
-      </w:pPr>
-      <w:r>
-        <w:rPr>
-          <w:rFonts w:ascii="Avenir Next" w:hAnsi="Avenir Next" w:cs="Avenir Next"/>
-          <w:b w:val="0"/>
-          <w:i w:val="0"/>
-          <w:color w:val="000000"/>
-          <w:sz w:val="25"/>
-        </w:rPr>
-        <w:t>Learning Theories</w:t>
-      </w:r>
-    </w:p>
-    <w:p>
-      <w:pPr>
-        <w:spacing w:after="140" w:line="324" w:lineRule="auto"/>
-      </w:pPr>
-      <w:r>
-        <w:rPr>
-          <w:rFonts w:ascii="Avenir Next" w:hAnsi="Avenir Next" w:cs="Avenir Next"/>
-          <w:b w:val="0"/>
-          <w:i w:val="0"/>
-          <w:color w:val="000000"/>
-          <w:sz w:val="25"/>
-        </w:rPr>
-        <w:t>2</w:t>
-      </w:r>
-    </w:p>
-    <w:p>
-      <w:pPr>
-        <w:spacing w:after="140" w:line="324" w:lineRule="auto"/>
-      </w:pPr>
-      <w:r>
-        <w:rPr>
-          <w:rFonts w:ascii="Avenir Next" w:hAnsi="Avenir Next" w:cs="Avenir Next"/>
-          <w:b w:val="0"/>
-          <w:i w:val="0"/>
-          <w:color w:val="000000"/>
-          <w:sz w:val="25"/>
-        </w:rPr>
-        <w:t>Load-Bearing Frameworks</w:t>
       </w:r>
     </w:p>
     <w:p>

</xml_diff>

<commit_message>
content: scrub all judge-visible 'Claude'/'Anthropic Claude' references
A judge should not see which specific AI vendor we use; only that AI is used.
Replace all rendered mentions with generic, honest equivalents — keep code
comments and internal endpoint/API names (they never reach the screen).

- 6 mission briefs: "YOUR TEAM (per CLAUDE.md §6)" → "YOUR TEAM"
- NPC interview alert + ai-judges error: "Claude proxy" → "the AI engine"
- Scenario disclaimer (EN+TH): "Anthropic Claude" → "an advanced AI language
  model" / "โมเดลภาษาเอไอขั้นสูง"; fixed stale "Pitch Capsule" → "Voice for Change"
- READ-THIS-FIRST + Teacher Manual + Scrutiny Report PDFs rebuilt; binary scan
  confirms zero residual "Claude API" / "Anthropic Claude" hits.

Co-Authored-By: Claude Opus 4.7 (1M context) <noreply@anthropic.com>
</commit_message>
<xml_diff>
--- a/docs/teacher-manual/FUTUREPROOF-Teacher-Manual.docx
+++ b/docs/teacher-manual/FUTUREPROOF-Teacher-Manual.docx
@@ -1132,7 +1132,7 @@
           <w:color w:val="000000"/>
           <w:sz w:val="25"/>
         </w:rPr>
-        <w:t>HTML5 + Tailwind CSS + vanilla JS · Firebase (auth, Realtime DB, Storage) · Anthropic Claude API · Stability.ai for avatars · Netlify hosting.</w:t>
+        <w:t>HTML5 + Tailwind CSS + vanilla JS · Firebase (auth, Realtime DB, Storage) · an advanced AI language model API · Stability.ai for avatars · Netlify hosting.</w:t>
       </w:r>
     </w:p>
     <w:p>
@@ -2863,7 +2863,7 @@
           <w:color w:val="000000"/>
           <w:sz w:val="25"/>
         </w:rPr>
-        <w:t>Netlify Functions wrap Anthropic Claude API (Sonnet) and Stability.ai. API keys live in Netlify env vars — never reach the browser. Per-call rate-limiting and per-user daily quotas.</w:t>
+        <w:t>Netlify Functions wrap an advanced AI language model API and Stability.ai. API keys live in Netlify env vars — never reach the browser. Per-call rate-limiting and per-user daily quotas.</w:t>
       </w:r>
     </w:p>
     <w:p>
@@ -2989,7 +2989,7 @@
           <w:color w:val="000000"/>
           <w:sz w:val="25"/>
         </w:rPr>
-        <w:t>Mission decision → AI Judge → token award. Each decision call goes to Claude through the Netlify proxy with the Rubric B system prompt; the response includes scores per criterion, a growthEdge string, and a token delta.</w:t>
+        <w:t>Mission decision → AI Judge → token award. Each decision call goes to the AI through the Netlify proxy with the Rubric B system prompt; the response includes scores per criterion, a growthEdge string, and a token delta.</w:t>
       </w:r>
     </w:p>
     <w:p>

</xml_diff>